<commit_message>
feat: initialize deployment distribution, add frontend components, and integrate backend model services
</commit_message>
<xml_diff>
--- a/outputs/model_specifications_and_evaluation_report.docx
+++ b/outputs/model_specifications_and_evaluation_report.docx
@@ -2450,6 +2450,32 @@
     </w:p>
     <w:p>
       <w:pPr>
+        <w:pStyle w:val="Heading2"/>
+      </w:pPr>
+      <w:r>
+        <w:t>2.4 Model D: Recurrent CNN (RCNN)</w:t>
+      </w:r>
+    </w:p>
+    <w:p>
+      <w:pPr/>
+      <w:r>
+        <w:t>The Recurrent Convolutional Neural Network (RCNN) is a specialized neural network architecture designed to enhance feature representations by incorporating recurrent connections within the convolutional layers. Based on the architecture by Liang &amp; Hu (2015), the RCNN utilizes Recurrent Convolutional Layers (RCL) where the state of each unit evolves over discrete time steps. This allows the model to integrate contextual information and expand its receptive field dynamically without increasing the parameter footprint.</w:t>
+      </w:r>
+    </w:p>
+    <w:p>
+      <w:pPr/>
+      <w:r>
+        <w:t>For this binary classification task, the Recurrent CNN is configured with a base convolution layer that projects the 3-channel input to 32 feature maps with stride 2. This is followed by four RCL blocks with time step T = 3, configured as follows: Block 1 (64 channels), Block 2 (128 channels), Block 3 (256 channels), and Block 4 (512 channels). Max pooling (2x2) and dropout are applied between the blocks. A Global Average Pooling layer reduces the spatial features to 512 dimensions, which are passed to a dense head of 128 units, followed by a final linear layer outputting the classification logit.</w:t>
+      </w:r>
+    </w:p>
+    <w:p>
+      <w:pPr/>
+      <w:r>
+        <w:t>Total Trainable Parameters: 4,768,801 parameters. The RCNN is initialized from scratch and optimized using AdamW under mixed precision.</w:t>
+      </w:r>
+    </w:p>
+    <w:p>
+      <w:pPr>
         <w:pStyle w:val="Heading1"/>
         <w:spacing w:before="360" w:after="120"/>
       </w:pPr>
@@ -3130,6 +3156,78 @@
           </w:p>
         </w:tc>
       </w:tr>
+      <w:tr>
+        <w:tc>
+          <w:tcPr>
+            <w:tcW w:type="dxa" w:w="1676"/>
+          </w:tcPr>
+          <w:p>
+            <w:r>
+              <w:t>Recurrent CNN (RCNN)</w:t>
+            </w:r>
+          </w:p>
+        </w:tc>
+        <w:tc>
+          <w:tcPr>
+            <w:tcW w:type="dxa" w:w="1320"/>
+          </w:tcPr>
+          <w:p>
+            <w:r>
+              <w:t>93.32%</w:t>
+            </w:r>
+          </w:p>
+        </w:tc>
+        <w:tc>
+          <w:tcPr>
+            <w:tcW w:type="dxa" w:w="1320"/>
+          </w:tcPr>
+          <w:p>
+            <w:r>
+              <w:t>88.60%</w:t>
+            </w:r>
+          </w:p>
+        </w:tc>
+        <w:tc>
+          <w:tcPr>
+            <w:tcW w:type="dxa" w:w="1311"/>
+          </w:tcPr>
+          <w:p>
+            <w:r>
+              <w:t>99.43%</w:t>
+            </w:r>
+          </w:p>
+        </w:tc>
+        <w:tc>
+          <w:tcPr>
+            <w:tcW w:type="dxa" w:w="1311"/>
+          </w:tcPr>
+          <w:p>
+            <w:r>
+              <w:t>93.70%</w:t>
+            </w:r>
+          </w:p>
+        </w:tc>
+        <w:tc>
+          <w:tcPr>
+            <w:tcW w:type="dxa" w:w="1309"/>
+          </w:tcPr>
+          <w:p>
+            <w:r>
+              <w:t>0.9976</w:t>
+            </w:r>
+          </w:p>
+        </w:tc>
+        <w:tc>
+          <w:tcPr>
+            <w:tcW w:type="dxa" w:w="1313"/>
+          </w:tcPr>
+          <w:p>
+            <w:r>
+              <w:t>0.17 ms</w:t>
+            </w:r>
+          </w:p>
+        </w:tc>
+      </w:tr>
     </w:tbl>
     <w:p>
       <w:pPr>
@@ -3746,6 +3844,32 @@
     </w:p>
     <w:p>
       <w:pPr>
+        <w:pStyle w:val="Heading2"/>
+      </w:pPr>
+      <w:r>
+        <w:t>4.4 Algorithm 4: Recurrent CNN (RCNN)</w:t>
+      </w:r>
+    </w:p>
+    <w:p>
+      <w:pPr/>
+      <w:r>
+        <w:t>Figure 1. Training &amp; Validation curves for Recurrent CNN (RCNN)</w:t>
+      </w:r>
+    </w:p>
+    <w:p>
+      <w:pPr/>
+      <w:r>
+        <w:t>Figure 2. Test Confusion Matrix for Recurrent CNN (RCNN)</w:t>
+      </w:r>
+    </w:p>
+    <w:p>
+      <w:pPr/>
+      <w:r>
+        <w:t>Figure 3. ROC-AUC curve for Recurrent CNN (RCNN)</w:t>
+      </w:r>
+    </w:p>
+    <w:p>
+      <w:pPr>
         <w:pStyle w:val="Heading1"/>
         <w:spacing w:before="360" w:after="120"/>
       </w:pPr>

</xml_diff>